<commit_message>
fix(p3): remediate PR645 buyer and normative blockers
</commit_message>
<xml_diff>
--- a/tools/candidates/p3-full-11-preflight-20261015/candidate/01-proverochnyy-list-komplekta-ks.docx
+++ b/tools/candidates/p3-full-11-preflight-20261015/candidate/01-proverochnyy-list-komplekta-ks.docx
@@ -76,7 +76,7 @@
         </w:trPr>
         <w:tc>
           <w:tcPr>
-            <w:tcW w:type="dxa" w:w="680"/>
+            <w:tcW w:type="dxa" w:w="1037"/>
             <w:vAlign w:val="center"/>
             <w:shd w:fill="292C30"/>
             <w:tcMar>
@@ -88,6 +88,7 @@
           </w:tcPr>
           <w:p>
             <w:pPr>
+              <w:keepLines/>
               <w:spacing w:after="60" w:before="40" w:line="245" w:lineRule="auto"/>
             </w:pPr>
             <w:r>
@@ -104,7 +105,7 @@
         </w:tc>
         <w:tc>
           <w:tcPr>
-            <w:tcW w:type="dxa" w:w="7257"/>
+            <w:tcW w:type="dxa" w:w="7992"/>
             <w:vAlign w:val="center"/>
             <w:shd w:fill="292C30"/>
             <w:tcMar>
@@ -132,7 +133,7 @@
         </w:tc>
         <w:tc>
           <w:tcPr>
-            <w:tcW w:type="dxa" w:w="1928"/>
+            <w:tcW w:type="dxa" w:w="1728"/>
             <w:vAlign w:val="center"/>
             <w:shd w:fill="292C30"/>
             <w:tcMar>
@@ -165,7 +166,7 @@
         </w:trPr>
         <w:tc>
           <w:tcPr>
-            <w:tcW w:type="dxa" w:w="680"/>
+            <w:tcW w:type="dxa" w:w="1037"/>
             <w:vAlign w:val="center"/>
             <w:shd w:fill="FFFFFF"/>
             <w:tcMar>
@@ -177,6 +178,7 @@
           </w:tcPr>
           <w:p>
             <w:pPr>
+              <w:keepLines/>
               <w:spacing w:after="60" w:before="40" w:line="245" w:lineRule="auto"/>
             </w:pPr>
             <w:r>
@@ -193,7 +195,7 @@
         </w:tc>
         <w:tc>
           <w:tcPr>
-            <w:tcW w:type="dxa" w:w="7257"/>
+            <w:tcW w:type="dxa" w:w="7992"/>
             <w:vAlign w:val="center"/>
             <w:shd w:fill="FFFFFF"/>
             <w:tcMar>
@@ -221,7 +223,7 @@
         </w:tc>
         <w:tc>
           <w:tcPr>
-            <w:tcW w:type="dxa" w:w="1928"/>
+            <w:tcW w:type="dxa" w:w="1728"/>
             <w:vAlign w:val="center"/>
             <w:shd w:fill="FFFFFF"/>
             <w:tcMar>
@@ -253,7 +255,7 @@
         </w:trPr>
         <w:tc>
           <w:tcPr>
-            <w:tcW w:type="dxa" w:w="680"/>
+            <w:tcW w:type="dxa" w:w="1037"/>
             <w:vAlign w:val="center"/>
             <w:shd w:fill="F6F4EF"/>
             <w:tcMar>
@@ -265,6 +267,7 @@
           </w:tcPr>
           <w:p>
             <w:pPr>
+              <w:keepLines/>
               <w:spacing w:after="60" w:before="40" w:line="245" w:lineRule="auto"/>
             </w:pPr>
             <w:r>
@@ -281,7 +284,7 @@
         </w:tc>
         <w:tc>
           <w:tcPr>
-            <w:tcW w:type="dxa" w:w="7257"/>
+            <w:tcW w:type="dxa" w:w="7992"/>
             <w:vAlign w:val="center"/>
             <w:shd w:fill="F6F4EF"/>
             <w:tcMar>
@@ -309,7 +312,7 @@
         </w:tc>
         <w:tc>
           <w:tcPr>
-            <w:tcW w:type="dxa" w:w="1928"/>
+            <w:tcW w:type="dxa" w:w="1728"/>
             <w:vAlign w:val="center"/>
             <w:shd w:fill="F6F4EF"/>
             <w:tcMar>
@@ -341,7 +344,7 @@
         </w:trPr>
         <w:tc>
           <w:tcPr>
-            <w:tcW w:type="dxa" w:w="680"/>
+            <w:tcW w:type="dxa" w:w="1037"/>
             <w:vAlign w:val="center"/>
             <w:shd w:fill="FFFFFF"/>
             <w:tcMar>
@@ -353,6 +356,7 @@
           </w:tcPr>
           <w:p>
             <w:pPr>
+              <w:keepLines/>
               <w:spacing w:after="60" w:before="40" w:line="245" w:lineRule="auto"/>
             </w:pPr>
             <w:r>
@@ -369,7 +373,7 @@
         </w:tc>
         <w:tc>
           <w:tcPr>
-            <w:tcW w:type="dxa" w:w="7257"/>
+            <w:tcW w:type="dxa" w:w="7992"/>
             <w:vAlign w:val="center"/>
             <w:shd w:fill="FFFFFF"/>
             <w:tcMar>
@@ -397,7 +401,7 @@
         </w:tc>
         <w:tc>
           <w:tcPr>
-            <w:tcW w:type="dxa" w:w="1928"/>
+            <w:tcW w:type="dxa" w:w="1728"/>
             <w:vAlign w:val="center"/>
             <w:shd w:fill="FFFFFF"/>
             <w:tcMar>
@@ -429,7 +433,7 @@
         </w:trPr>
         <w:tc>
           <w:tcPr>
-            <w:tcW w:type="dxa" w:w="680"/>
+            <w:tcW w:type="dxa" w:w="1037"/>
             <w:vAlign w:val="center"/>
             <w:shd w:fill="F6F4EF"/>
             <w:tcMar>
@@ -441,6 +445,7 @@
           </w:tcPr>
           <w:p>
             <w:pPr>
+              <w:keepLines/>
               <w:spacing w:after="60" w:before="40" w:line="245" w:lineRule="auto"/>
             </w:pPr>
             <w:r>
@@ -457,7 +462,7 @@
         </w:tc>
         <w:tc>
           <w:tcPr>
-            <w:tcW w:type="dxa" w:w="7257"/>
+            <w:tcW w:type="dxa" w:w="7992"/>
             <w:vAlign w:val="center"/>
             <w:shd w:fill="F6F4EF"/>
             <w:tcMar>
@@ -485,7 +490,7 @@
         </w:tc>
         <w:tc>
           <w:tcPr>
-            <w:tcW w:type="dxa" w:w="1928"/>
+            <w:tcW w:type="dxa" w:w="1728"/>
             <w:vAlign w:val="center"/>
             <w:shd w:fill="F6F4EF"/>
             <w:tcMar>
@@ -517,7 +522,7 @@
         </w:trPr>
         <w:tc>
           <w:tcPr>
-            <w:tcW w:type="dxa" w:w="680"/>
+            <w:tcW w:type="dxa" w:w="1037"/>
             <w:vAlign w:val="center"/>
             <w:shd w:fill="FFFFFF"/>
             <w:tcMar>
@@ -529,6 +534,7 @@
           </w:tcPr>
           <w:p>
             <w:pPr>
+              <w:keepLines/>
               <w:spacing w:after="60" w:before="40" w:line="245" w:lineRule="auto"/>
             </w:pPr>
             <w:r>
@@ -545,7 +551,7 @@
         </w:tc>
         <w:tc>
           <w:tcPr>
-            <w:tcW w:type="dxa" w:w="7257"/>
+            <w:tcW w:type="dxa" w:w="7992"/>
             <w:vAlign w:val="center"/>
             <w:shd w:fill="FFFFFF"/>
             <w:tcMar>
@@ -573,7 +579,7 @@
         </w:tc>
         <w:tc>
           <w:tcPr>
-            <w:tcW w:type="dxa" w:w="1928"/>
+            <w:tcW w:type="dxa" w:w="1728"/>
             <w:vAlign w:val="center"/>
             <w:shd w:fill="FFFFFF"/>
             <w:tcMar>
@@ -605,7 +611,7 @@
         </w:trPr>
         <w:tc>
           <w:tcPr>
-            <w:tcW w:type="dxa" w:w="680"/>
+            <w:tcW w:type="dxa" w:w="1037"/>
             <w:vAlign w:val="center"/>
             <w:shd w:fill="F6F4EF"/>
             <w:tcMar>
@@ -617,6 +623,7 @@
           </w:tcPr>
           <w:p>
             <w:pPr>
+              <w:keepLines/>
               <w:spacing w:after="60" w:before="40" w:line="245" w:lineRule="auto"/>
             </w:pPr>
             <w:r>
@@ -633,7 +640,7 @@
         </w:tc>
         <w:tc>
           <w:tcPr>
-            <w:tcW w:type="dxa" w:w="7257"/>
+            <w:tcW w:type="dxa" w:w="7992"/>
             <w:vAlign w:val="center"/>
             <w:shd w:fill="F6F4EF"/>
             <w:tcMar>
@@ -661,7 +668,7 @@
         </w:tc>
         <w:tc>
           <w:tcPr>
-            <w:tcW w:type="dxa" w:w="1928"/>
+            <w:tcW w:type="dxa" w:w="1728"/>
             <w:vAlign w:val="center"/>
             <w:shd w:fill="F6F4EF"/>
             <w:tcMar>
@@ -693,7 +700,7 @@
         </w:trPr>
         <w:tc>
           <w:tcPr>
-            <w:tcW w:type="dxa" w:w="680"/>
+            <w:tcW w:type="dxa" w:w="1037"/>
             <w:vAlign w:val="center"/>
             <w:shd w:fill="FFFFFF"/>
             <w:tcMar>
@@ -705,6 +712,7 @@
           </w:tcPr>
           <w:p>
             <w:pPr>
+              <w:keepLines/>
               <w:spacing w:after="60" w:before="40" w:line="245" w:lineRule="auto"/>
             </w:pPr>
             <w:r>
@@ -721,7 +729,7 @@
         </w:tc>
         <w:tc>
           <w:tcPr>
-            <w:tcW w:type="dxa" w:w="7257"/>
+            <w:tcW w:type="dxa" w:w="7992"/>
             <w:vAlign w:val="center"/>
             <w:shd w:fill="FFFFFF"/>
             <w:tcMar>
@@ -749,7 +757,7 @@
         </w:tc>
         <w:tc>
           <w:tcPr>
-            <w:tcW w:type="dxa" w:w="1928"/>
+            <w:tcW w:type="dxa" w:w="1728"/>
             <w:vAlign w:val="center"/>
             <w:shd w:fill="FFFFFF"/>
             <w:tcMar>
@@ -781,7 +789,7 @@
         </w:trPr>
         <w:tc>
           <w:tcPr>
-            <w:tcW w:type="dxa" w:w="680"/>
+            <w:tcW w:type="dxa" w:w="1037"/>
             <w:vAlign w:val="center"/>
             <w:shd w:fill="F6F4EF"/>
             <w:tcMar>
@@ -793,6 +801,7 @@
           </w:tcPr>
           <w:p>
             <w:pPr>
+              <w:keepLines/>
               <w:spacing w:after="60" w:before="40" w:line="245" w:lineRule="auto"/>
             </w:pPr>
             <w:r>
@@ -809,7 +818,7 @@
         </w:tc>
         <w:tc>
           <w:tcPr>
-            <w:tcW w:type="dxa" w:w="7257"/>
+            <w:tcW w:type="dxa" w:w="7992"/>
             <w:vAlign w:val="center"/>
             <w:shd w:fill="F6F4EF"/>
             <w:tcMar>
@@ -837,7 +846,7 @@
         </w:tc>
         <w:tc>
           <w:tcPr>
-            <w:tcW w:type="dxa" w:w="1928"/>
+            <w:tcW w:type="dxa" w:w="1728"/>
             <w:vAlign w:val="center"/>
             <w:shd w:fill="F6F4EF"/>
             <w:tcMar>
@@ -869,7 +878,7 @@
         </w:trPr>
         <w:tc>
           <w:tcPr>
-            <w:tcW w:type="dxa" w:w="680"/>
+            <w:tcW w:type="dxa" w:w="1037"/>
             <w:vAlign w:val="center"/>
             <w:shd w:fill="FFFFFF"/>
             <w:tcMar>
@@ -881,6 +890,7 @@
           </w:tcPr>
           <w:p>
             <w:pPr>
+              <w:keepLines/>
               <w:spacing w:after="60" w:before="40" w:line="245" w:lineRule="auto"/>
             </w:pPr>
             <w:r>
@@ -897,7 +907,7 @@
         </w:tc>
         <w:tc>
           <w:tcPr>
-            <w:tcW w:type="dxa" w:w="7257"/>
+            <w:tcW w:type="dxa" w:w="7992"/>
             <w:vAlign w:val="center"/>
             <w:shd w:fill="FFFFFF"/>
             <w:tcMar>
@@ -925,7 +935,7 @@
         </w:tc>
         <w:tc>
           <w:tcPr>
-            <w:tcW w:type="dxa" w:w="1928"/>
+            <w:tcW w:type="dxa" w:w="1728"/>
             <w:vAlign w:val="center"/>
             <w:shd w:fill="FFFFFF"/>
             <w:tcMar>
@@ -957,7 +967,7 @@
         </w:trPr>
         <w:tc>
           <w:tcPr>
-            <w:tcW w:type="dxa" w:w="680"/>
+            <w:tcW w:type="dxa" w:w="1037"/>
             <w:vAlign w:val="center"/>
             <w:shd w:fill="F6F4EF"/>
             <w:tcMar>
@@ -969,6 +979,7 @@
           </w:tcPr>
           <w:p>
             <w:pPr>
+              <w:keepLines/>
               <w:spacing w:after="60" w:before="40" w:line="245" w:lineRule="auto"/>
             </w:pPr>
             <w:r>
@@ -985,7 +996,7 @@
         </w:tc>
         <w:tc>
           <w:tcPr>
-            <w:tcW w:type="dxa" w:w="7257"/>
+            <w:tcW w:type="dxa" w:w="7992"/>
             <w:vAlign w:val="center"/>
             <w:shd w:fill="F6F4EF"/>
             <w:tcMar>
@@ -1013,7 +1024,7 @@
         </w:tc>
         <w:tc>
           <w:tcPr>
-            <w:tcW w:type="dxa" w:w="1928"/>
+            <w:tcW w:type="dxa" w:w="1728"/>
             <w:vAlign w:val="center"/>
             <w:shd w:fill="F6F4EF"/>
             <w:tcMar>
@@ -1119,7 +1130,7 @@
         </w:trPr>
         <w:tc>
           <w:tcPr>
-            <w:tcW w:type="dxa" w:w="680"/>
+            <w:tcW w:type="dxa" w:w="1037"/>
             <w:vAlign w:val="center"/>
             <w:shd w:fill="292C30"/>
             <w:tcMar>
@@ -1131,6 +1142,7 @@
           </w:tcPr>
           <w:p>
             <w:pPr>
+              <w:keepLines/>
               <w:spacing w:after="60" w:before="40" w:line="245" w:lineRule="auto"/>
             </w:pPr>
             <w:r>
@@ -1147,7 +1159,7 @@
         </w:tc>
         <w:tc>
           <w:tcPr>
-            <w:tcW w:type="dxa" w:w="7257"/>
+            <w:tcW w:type="dxa" w:w="7992"/>
             <w:vAlign w:val="center"/>
             <w:shd w:fill="292C30"/>
             <w:tcMar>
@@ -1175,7 +1187,7 @@
         </w:tc>
         <w:tc>
           <w:tcPr>
-            <w:tcW w:type="dxa" w:w="1928"/>
+            <w:tcW w:type="dxa" w:w="1728"/>
             <w:vAlign w:val="center"/>
             <w:shd w:fill="292C30"/>
             <w:tcMar>
@@ -1208,7 +1220,7 @@
         </w:trPr>
         <w:tc>
           <w:tcPr>
-            <w:tcW w:type="dxa" w:w="680"/>
+            <w:tcW w:type="dxa" w:w="1037"/>
             <w:vAlign w:val="center"/>
             <w:shd w:fill="FFFFFF"/>
             <w:tcMar>
@@ -1220,6 +1232,7 @@
           </w:tcPr>
           <w:p>
             <w:pPr>
+              <w:keepLines/>
               <w:spacing w:after="60" w:before="40" w:line="245" w:lineRule="auto"/>
             </w:pPr>
             <w:r>
@@ -1236,7 +1249,7 @@
         </w:tc>
         <w:tc>
           <w:tcPr>
-            <w:tcW w:type="dxa" w:w="7257"/>
+            <w:tcW w:type="dxa" w:w="7992"/>
             <w:vAlign w:val="center"/>
             <w:shd w:fill="FFFFFF"/>
             <w:tcMar>
@@ -1264,7 +1277,7 @@
         </w:tc>
         <w:tc>
           <w:tcPr>
-            <w:tcW w:type="dxa" w:w="1928"/>
+            <w:tcW w:type="dxa" w:w="1728"/>
             <w:vAlign w:val="center"/>
             <w:shd w:fill="FFFFFF"/>
             <w:tcMar>
@@ -1296,7 +1309,7 @@
         </w:trPr>
         <w:tc>
           <w:tcPr>
-            <w:tcW w:type="dxa" w:w="680"/>
+            <w:tcW w:type="dxa" w:w="1037"/>
             <w:vAlign w:val="center"/>
             <w:shd w:fill="F6F4EF"/>
             <w:tcMar>
@@ -1308,6 +1321,7 @@
           </w:tcPr>
           <w:p>
             <w:pPr>
+              <w:keepLines/>
               <w:spacing w:after="60" w:before="40" w:line="245" w:lineRule="auto"/>
             </w:pPr>
             <w:r>
@@ -1324,7 +1338,7 @@
         </w:tc>
         <w:tc>
           <w:tcPr>
-            <w:tcW w:type="dxa" w:w="7257"/>
+            <w:tcW w:type="dxa" w:w="7992"/>
             <w:vAlign w:val="center"/>
             <w:shd w:fill="F6F4EF"/>
             <w:tcMar>
@@ -1352,7 +1366,7 @@
         </w:tc>
         <w:tc>
           <w:tcPr>
-            <w:tcW w:type="dxa" w:w="1928"/>
+            <w:tcW w:type="dxa" w:w="1728"/>
             <w:vAlign w:val="center"/>
             <w:shd w:fill="F6F4EF"/>
             <w:tcMar>
@@ -1384,7 +1398,7 @@
         </w:trPr>
         <w:tc>
           <w:tcPr>
-            <w:tcW w:type="dxa" w:w="680"/>
+            <w:tcW w:type="dxa" w:w="1037"/>
             <w:vAlign w:val="center"/>
             <w:shd w:fill="FFFFFF"/>
             <w:tcMar>
@@ -1396,6 +1410,7 @@
           </w:tcPr>
           <w:p>
             <w:pPr>
+              <w:keepLines/>
               <w:spacing w:after="60" w:before="40" w:line="245" w:lineRule="auto"/>
             </w:pPr>
             <w:r>
@@ -1412,7 +1427,7 @@
         </w:tc>
         <w:tc>
           <w:tcPr>
-            <w:tcW w:type="dxa" w:w="7257"/>
+            <w:tcW w:type="dxa" w:w="7992"/>
             <w:vAlign w:val="center"/>
             <w:shd w:fill="FFFFFF"/>
             <w:tcMar>
@@ -1440,7 +1455,7 @@
         </w:tc>
         <w:tc>
           <w:tcPr>
-            <w:tcW w:type="dxa" w:w="1928"/>
+            <w:tcW w:type="dxa" w:w="1728"/>
             <w:vAlign w:val="center"/>
             <w:shd w:fill="FFFFFF"/>
             <w:tcMar>
@@ -1472,7 +1487,7 @@
         </w:trPr>
         <w:tc>
           <w:tcPr>
-            <w:tcW w:type="dxa" w:w="680"/>
+            <w:tcW w:type="dxa" w:w="1037"/>
             <w:vAlign w:val="center"/>
             <w:shd w:fill="F6F4EF"/>
             <w:tcMar>
@@ -1484,6 +1499,7 @@
           </w:tcPr>
           <w:p>
             <w:pPr>
+              <w:keepLines/>
               <w:spacing w:after="60" w:before="40" w:line="245" w:lineRule="auto"/>
             </w:pPr>
             <w:r>
@@ -1500,7 +1516,7 @@
         </w:tc>
         <w:tc>
           <w:tcPr>
-            <w:tcW w:type="dxa" w:w="7257"/>
+            <w:tcW w:type="dxa" w:w="7992"/>
             <w:vAlign w:val="center"/>
             <w:shd w:fill="F6F4EF"/>
             <w:tcMar>
@@ -1528,7 +1544,7 @@
         </w:tc>
         <w:tc>
           <w:tcPr>
-            <w:tcW w:type="dxa" w:w="1928"/>
+            <w:tcW w:type="dxa" w:w="1728"/>
             <w:vAlign w:val="center"/>
             <w:shd w:fill="F6F4EF"/>
             <w:tcMar>
@@ -1560,7 +1576,7 @@
         </w:trPr>
         <w:tc>
           <w:tcPr>
-            <w:tcW w:type="dxa" w:w="680"/>
+            <w:tcW w:type="dxa" w:w="1037"/>
             <w:vAlign w:val="center"/>
             <w:shd w:fill="FFFFFF"/>
             <w:tcMar>
@@ -1572,6 +1588,7 @@
           </w:tcPr>
           <w:p>
             <w:pPr>
+              <w:keepLines/>
               <w:spacing w:after="60" w:before="40" w:line="245" w:lineRule="auto"/>
             </w:pPr>
             <w:r>
@@ -1588,7 +1605,7 @@
         </w:tc>
         <w:tc>
           <w:tcPr>
-            <w:tcW w:type="dxa" w:w="7257"/>
+            <w:tcW w:type="dxa" w:w="7992"/>
             <w:vAlign w:val="center"/>
             <w:shd w:fill="FFFFFF"/>
             <w:tcMar>
@@ -1616,7 +1633,7 @@
         </w:tc>
         <w:tc>
           <w:tcPr>
-            <w:tcW w:type="dxa" w:w="1928"/>
+            <w:tcW w:type="dxa" w:w="1728"/>
             <w:vAlign w:val="center"/>
             <w:shd w:fill="FFFFFF"/>
             <w:tcMar>
@@ -1648,7 +1665,7 @@
         </w:trPr>
         <w:tc>
           <w:tcPr>
-            <w:tcW w:type="dxa" w:w="680"/>
+            <w:tcW w:type="dxa" w:w="1037"/>
             <w:vAlign w:val="center"/>
             <w:shd w:fill="F6F4EF"/>
             <w:tcMar>
@@ -1660,6 +1677,7 @@
           </w:tcPr>
           <w:p>
             <w:pPr>
+              <w:keepLines/>
               <w:spacing w:after="60" w:before="40" w:line="245" w:lineRule="auto"/>
             </w:pPr>
             <w:r>
@@ -1676,7 +1694,7 @@
         </w:tc>
         <w:tc>
           <w:tcPr>
-            <w:tcW w:type="dxa" w:w="7257"/>
+            <w:tcW w:type="dxa" w:w="7992"/>
             <w:vAlign w:val="center"/>
             <w:shd w:fill="F6F4EF"/>
             <w:tcMar>
@@ -1704,7 +1722,7 @@
         </w:tc>
         <w:tc>
           <w:tcPr>
-            <w:tcW w:type="dxa" w:w="1928"/>
+            <w:tcW w:type="dxa" w:w="1728"/>
             <w:vAlign w:val="center"/>
             <w:shd w:fill="F6F4EF"/>
             <w:tcMar>
@@ -1736,7 +1754,7 @@
         </w:trPr>
         <w:tc>
           <w:tcPr>
-            <w:tcW w:type="dxa" w:w="680"/>
+            <w:tcW w:type="dxa" w:w="1037"/>
             <w:vAlign w:val="center"/>
             <w:shd w:fill="FFFFFF"/>
             <w:tcMar>
@@ -1748,6 +1766,7 @@
           </w:tcPr>
           <w:p>
             <w:pPr>
+              <w:keepLines/>
               <w:spacing w:after="60" w:before="40" w:line="245" w:lineRule="auto"/>
             </w:pPr>
             <w:r>
@@ -1764,7 +1783,7 @@
         </w:tc>
         <w:tc>
           <w:tcPr>
-            <w:tcW w:type="dxa" w:w="7257"/>
+            <w:tcW w:type="dxa" w:w="7992"/>
             <w:vAlign w:val="center"/>
             <w:shd w:fill="FFFFFF"/>
             <w:tcMar>
@@ -1792,7 +1811,7 @@
         </w:tc>
         <w:tc>
           <w:tcPr>
-            <w:tcW w:type="dxa" w:w="1928"/>
+            <w:tcW w:type="dxa" w:w="1728"/>
             <w:vAlign w:val="center"/>
             <w:shd w:fill="FFFFFF"/>
             <w:tcMar>
@@ -1824,7 +1843,7 @@
         </w:trPr>
         <w:tc>
           <w:tcPr>
-            <w:tcW w:type="dxa" w:w="680"/>
+            <w:tcW w:type="dxa" w:w="1037"/>
             <w:vAlign w:val="center"/>
             <w:shd w:fill="F6F4EF"/>
             <w:tcMar>
@@ -1836,6 +1855,7 @@
           </w:tcPr>
           <w:p>
             <w:pPr>
+              <w:keepLines/>
               <w:spacing w:after="60" w:before="40" w:line="245" w:lineRule="auto"/>
             </w:pPr>
             <w:r>
@@ -1852,7 +1872,7 @@
         </w:tc>
         <w:tc>
           <w:tcPr>
-            <w:tcW w:type="dxa" w:w="7257"/>
+            <w:tcW w:type="dxa" w:w="7992"/>
             <w:vAlign w:val="center"/>
             <w:shd w:fill="F6F4EF"/>
             <w:tcMar>
@@ -1880,7 +1900,7 @@
         </w:tc>
         <w:tc>
           <w:tcPr>
-            <w:tcW w:type="dxa" w:w="1928"/>
+            <w:tcW w:type="dxa" w:w="1728"/>
             <w:vAlign w:val="center"/>
             <w:shd w:fill="F6F4EF"/>
             <w:tcMar>
@@ -1912,7 +1932,7 @@
         </w:trPr>
         <w:tc>
           <w:tcPr>
-            <w:tcW w:type="dxa" w:w="680"/>
+            <w:tcW w:type="dxa" w:w="1037"/>
             <w:vAlign w:val="center"/>
             <w:shd w:fill="FFFFFF"/>
             <w:tcMar>
@@ -1924,6 +1944,7 @@
           </w:tcPr>
           <w:p>
             <w:pPr>
+              <w:keepLines/>
               <w:spacing w:after="60" w:before="40" w:line="245" w:lineRule="auto"/>
             </w:pPr>
             <w:r>
@@ -1940,7 +1961,7 @@
         </w:tc>
         <w:tc>
           <w:tcPr>
-            <w:tcW w:type="dxa" w:w="7257"/>
+            <w:tcW w:type="dxa" w:w="7992"/>
             <w:vAlign w:val="center"/>
             <w:shd w:fill="FFFFFF"/>
             <w:tcMar>
@@ -1968,7 +1989,7 @@
         </w:tc>
         <w:tc>
           <w:tcPr>
-            <w:tcW w:type="dxa" w:w="1928"/>
+            <w:tcW w:type="dxa" w:w="1728"/>
             <w:vAlign w:val="center"/>
             <w:shd w:fill="FFFFFF"/>
             <w:tcMar>
@@ -2000,7 +2021,7 @@
         </w:trPr>
         <w:tc>
           <w:tcPr>
-            <w:tcW w:type="dxa" w:w="680"/>
+            <w:tcW w:type="dxa" w:w="1037"/>
             <w:vAlign w:val="center"/>
             <w:shd w:fill="F6F4EF"/>
             <w:tcMar>
@@ -2012,6 +2033,7 @@
           </w:tcPr>
           <w:p>
             <w:pPr>
+              <w:keepLines/>
               <w:spacing w:after="60" w:before="40" w:line="245" w:lineRule="auto"/>
             </w:pPr>
             <w:r>
@@ -2028,7 +2050,7 @@
         </w:tc>
         <w:tc>
           <w:tcPr>
-            <w:tcW w:type="dxa" w:w="7257"/>
+            <w:tcW w:type="dxa" w:w="7992"/>
             <w:vAlign w:val="center"/>
             <w:shd w:fill="F6F4EF"/>
             <w:tcMar>
@@ -2056,7 +2078,7 @@
         </w:tc>
         <w:tc>
           <w:tcPr>
-            <w:tcW w:type="dxa" w:w="1928"/>
+            <w:tcW w:type="dxa" w:w="1728"/>
             <w:vAlign w:val="center"/>
             <w:shd w:fill="F6F4EF"/>
             <w:tcMar>
@@ -2088,22 +2110,8 @@
         <w:spacing w:after="60"/>
       </w:pPr>
       <w:r>
-        <w:rPr>
-          <w:b w:val="0"/>
-          <w:i w:val="0"/>
-          <w:sz w:val="16"/>
-        </w:rPr>
-        <w:t xml:space="preserve">Основание: </w:t>
+        <w:t>Исторический источник унифицированного образца и указаний КС-2 — постановление Госкомстата № 100 от 11.11.1999. Применимость формы определяйте по учетной политике, договору и специальным нормам.</w:t>
       </w:r>
-      <w:hyperlink r:id="rId11">
-        <w:r>
-          <w:rPr>
-            <w:sz w:val="16"/>
-            <w:color w:val="292C30"/>
-          </w:rPr>
-          <w:t>КС-2: указания к форме, постановление Госкомстата № 100 от 11.11.1999</w:t>
-        </w:r>
-      </w:hyperlink>
     </w:p>
     <w:p>
       <w:r>
@@ -2184,7 +2192,7 @@
         </w:trPr>
         <w:tc>
           <w:tcPr>
-            <w:tcW w:type="dxa" w:w="680"/>
+            <w:tcW w:type="dxa" w:w="1037"/>
             <w:vAlign w:val="center"/>
             <w:shd w:fill="292C30"/>
             <w:tcMar>
@@ -2196,6 +2204,7 @@
           </w:tcPr>
           <w:p>
             <w:pPr>
+              <w:keepLines/>
               <w:spacing w:after="60" w:before="40" w:line="245" w:lineRule="auto"/>
             </w:pPr>
             <w:r>
@@ -2212,7 +2221,7 @@
         </w:tc>
         <w:tc>
           <w:tcPr>
-            <w:tcW w:type="dxa" w:w="7257"/>
+            <w:tcW w:type="dxa" w:w="7992"/>
             <w:vAlign w:val="center"/>
             <w:shd w:fill="292C30"/>
             <w:tcMar>
@@ -2240,7 +2249,7 @@
         </w:tc>
         <w:tc>
           <w:tcPr>
-            <w:tcW w:type="dxa" w:w="1928"/>
+            <w:tcW w:type="dxa" w:w="1728"/>
             <w:vAlign w:val="center"/>
             <w:shd w:fill="292C30"/>
             <w:tcMar>
@@ -2273,7 +2282,7 @@
         </w:trPr>
         <w:tc>
           <w:tcPr>
-            <w:tcW w:type="dxa" w:w="680"/>
+            <w:tcW w:type="dxa" w:w="1037"/>
             <w:vAlign w:val="center"/>
             <w:shd w:fill="FFFFFF"/>
             <w:tcMar>
@@ -2285,6 +2294,7 @@
           </w:tcPr>
           <w:p>
             <w:pPr>
+              <w:keepLines/>
               <w:spacing w:after="60" w:before="40" w:line="245" w:lineRule="auto"/>
             </w:pPr>
             <w:r>
@@ -2301,7 +2311,7 @@
         </w:tc>
         <w:tc>
           <w:tcPr>
-            <w:tcW w:type="dxa" w:w="7257"/>
+            <w:tcW w:type="dxa" w:w="7992"/>
             <w:vAlign w:val="center"/>
             <w:shd w:fill="FFFFFF"/>
             <w:tcMar>
@@ -2329,7 +2339,7 @@
         </w:tc>
         <w:tc>
           <w:tcPr>
-            <w:tcW w:type="dxa" w:w="1928"/>
+            <w:tcW w:type="dxa" w:w="1728"/>
             <w:vAlign w:val="center"/>
             <w:shd w:fill="FFFFFF"/>
             <w:tcMar>
@@ -2361,7 +2371,7 @@
         </w:trPr>
         <w:tc>
           <w:tcPr>
-            <w:tcW w:type="dxa" w:w="680"/>
+            <w:tcW w:type="dxa" w:w="1037"/>
             <w:vAlign w:val="center"/>
             <w:shd w:fill="F6F4EF"/>
             <w:tcMar>
@@ -2373,6 +2383,7 @@
           </w:tcPr>
           <w:p>
             <w:pPr>
+              <w:keepLines/>
               <w:spacing w:after="60" w:before="40" w:line="245" w:lineRule="auto"/>
             </w:pPr>
             <w:r>
@@ -2389,7 +2400,7 @@
         </w:tc>
         <w:tc>
           <w:tcPr>
-            <w:tcW w:type="dxa" w:w="7257"/>
+            <w:tcW w:type="dxa" w:w="7992"/>
             <w:vAlign w:val="center"/>
             <w:shd w:fill="F6F4EF"/>
             <w:tcMar>
@@ -2417,7 +2428,7 @@
         </w:tc>
         <w:tc>
           <w:tcPr>
-            <w:tcW w:type="dxa" w:w="1928"/>
+            <w:tcW w:type="dxa" w:w="1728"/>
             <w:vAlign w:val="center"/>
             <w:shd w:fill="F6F4EF"/>
             <w:tcMar>
@@ -2449,7 +2460,7 @@
         </w:trPr>
         <w:tc>
           <w:tcPr>
-            <w:tcW w:type="dxa" w:w="680"/>
+            <w:tcW w:type="dxa" w:w="1037"/>
             <w:vAlign w:val="center"/>
             <w:shd w:fill="FFFFFF"/>
             <w:tcMar>
@@ -2461,6 +2472,7 @@
           </w:tcPr>
           <w:p>
             <w:pPr>
+              <w:keepLines/>
               <w:spacing w:after="60" w:before="40" w:line="245" w:lineRule="auto"/>
             </w:pPr>
             <w:r>
@@ -2477,7 +2489,7 @@
         </w:tc>
         <w:tc>
           <w:tcPr>
-            <w:tcW w:type="dxa" w:w="7257"/>
+            <w:tcW w:type="dxa" w:w="7992"/>
             <w:vAlign w:val="center"/>
             <w:shd w:fill="FFFFFF"/>
             <w:tcMar>
@@ -2505,7 +2517,7 @@
         </w:tc>
         <w:tc>
           <w:tcPr>
-            <w:tcW w:type="dxa" w:w="1928"/>
+            <w:tcW w:type="dxa" w:w="1728"/>
             <w:vAlign w:val="center"/>
             <w:shd w:fill="FFFFFF"/>
             <w:tcMar>
@@ -2537,7 +2549,7 @@
         </w:trPr>
         <w:tc>
           <w:tcPr>
-            <w:tcW w:type="dxa" w:w="680"/>
+            <w:tcW w:type="dxa" w:w="1037"/>
             <w:vAlign w:val="center"/>
             <w:shd w:fill="F6F4EF"/>
             <w:tcMar>
@@ -2549,6 +2561,7 @@
           </w:tcPr>
           <w:p>
             <w:pPr>
+              <w:keepLines/>
               <w:spacing w:after="60" w:before="40" w:line="245" w:lineRule="auto"/>
             </w:pPr>
             <w:r>
@@ -2565,7 +2578,7 @@
         </w:tc>
         <w:tc>
           <w:tcPr>
-            <w:tcW w:type="dxa" w:w="7257"/>
+            <w:tcW w:type="dxa" w:w="7992"/>
             <w:vAlign w:val="center"/>
             <w:shd w:fill="F6F4EF"/>
             <w:tcMar>
@@ -2593,7 +2606,7 @@
         </w:tc>
         <w:tc>
           <w:tcPr>
-            <w:tcW w:type="dxa" w:w="1928"/>
+            <w:tcW w:type="dxa" w:w="1728"/>
             <w:vAlign w:val="center"/>
             <w:shd w:fill="F6F4EF"/>
             <w:tcMar>
@@ -2625,7 +2638,7 @@
         </w:trPr>
         <w:tc>
           <w:tcPr>
-            <w:tcW w:type="dxa" w:w="680"/>
+            <w:tcW w:type="dxa" w:w="1037"/>
             <w:vAlign w:val="center"/>
             <w:shd w:fill="FFFFFF"/>
             <w:tcMar>
@@ -2637,6 +2650,7 @@
           </w:tcPr>
           <w:p>
             <w:pPr>
+              <w:keepLines/>
               <w:spacing w:after="60" w:before="40" w:line="245" w:lineRule="auto"/>
             </w:pPr>
             <w:r>
@@ -2653,7 +2667,7 @@
         </w:tc>
         <w:tc>
           <w:tcPr>
-            <w:tcW w:type="dxa" w:w="7257"/>
+            <w:tcW w:type="dxa" w:w="7992"/>
             <w:vAlign w:val="center"/>
             <w:shd w:fill="FFFFFF"/>
             <w:tcMar>
@@ -2681,7 +2695,7 @@
         </w:tc>
         <w:tc>
           <w:tcPr>
-            <w:tcW w:type="dxa" w:w="1928"/>
+            <w:tcW w:type="dxa" w:w="1728"/>
             <w:vAlign w:val="center"/>
             <w:shd w:fill="FFFFFF"/>
             <w:tcMar>
@@ -2713,7 +2727,7 @@
         </w:trPr>
         <w:tc>
           <w:tcPr>
-            <w:tcW w:type="dxa" w:w="680"/>
+            <w:tcW w:type="dxa" w:w="1037"/>
             <w:vAlign w:val="center"/>
             <w:shd w:fill="F6F4EF"/>
             <w:tcMar>
@@ -2725,6 +2739,7 @@
           </w:tcPr>
           <w:p>
             <w:pPr>
+              <w:keepLines/>
               <w:spacing w:after="60" w:before="40" w:line="245" w:lineRule="auto"/>
             </w:pPr>
             <w:r>
@@ -2741,7 +2756,7 @@
         </w:tc>
         <w:tc>
           <w:tcPr>
-            <w:tcW w:type="dxa" w:w="7257"/>
+            <w:tcW w:type="dxa" w:w="7992"/>
             <w:vAlign w:val="center"/>
             <w:shd w:fill="F6F4EF"/>
             <w:tcMar>
@@ -2769,7 +2784,7 @@
         </w:tc>
         <w:tc>
           <w:tcPr>
-            <w:tcW w:type="dxa" w:w="1928"/>
+            <w:tcW w:type="dxa" w:w="1728"/>
             <w:vAlign w:val="center"/>
             <w:shd w:fill="F6F4EF"/>
             <w:tcMar>
@@ -2801,7 +2816,7 @@
         </w:trPr>
         <w:tc>
           <w:tcPr>
-            <w:tcW w:type="dxa" w:w="680"/>
+            <w:tcW w:type="dxa" w:w="1037"/>
             <w:vAlign w:val="center"/>
             <w:shd w:fill="FFFFFF"/>
             <w:tcMar>
@@ -2813,6 +2828,7 @@
           </w:tcPr>
           <w:p>
             <w:pPr>
+              <w:keepLines/>
               <w:spacing w:after="60" w:before="40" w:line="245" w:lineRule="auto"/>
             </w:pPr>
             <w:r>
@@ -2829,7 +2845,7 @@
         </w:tc>
         <w:tc>
           <w:tcPr>
-            <w:tcW w:type="dxa" w:w="7257"/>
+            <w:tcW w:type="dxa" w:w="7992"/>
             <w:vAlign w:val="center"/>
             <w:shd w:fill="FFFFFF"/>
             <w:tcMar>
@@ -2857,7 +2873,7 @@
         </w:tc>
         <w:tc>
           <w:tcPr>
-            <w:tcW w:type="dxa" w:w="1928"/>
+            <w:tcW w:type="dxa" w:w="1728"/>
             <w:vAlign w:val="center"/>
             <w:shd w:fill="FFFFFF"/>
             <w:tcMar>
@@ -2889,7 +2905,7 @@
         </w:trPr>
         <w:tc>
           <w:tcPr>
-            <w:tcW w:type="dxa" w:w="680"/>
+            <w:tcW w:type="dxa" w:w="1037"/>
             <w:vAlign w:val="center"/>
             <w:shd w:fill="F6F4EF"/>
             <w:tcMar>
@@ -2901,6 +2917,7 @@
           </w:tcPr>
           <w:p>
             <w:pPr>
+              <w:keepLines/>
               <w:spacing w:after="60" w:before="40" w:line="245" w:lineRule="auto"/>
             </w:pPr>
             <w:r>
@@ -2917,7 +2934,7 @@
         </w:tc>
         <w:tc>
           <w:tcPr>
-            <w:tcW w:type="dxa" w:w="7257"/>
+            <w:tcW w:type="dxa" w:w="7992"/>
             <w:vAlign w:val="center"/>
             <w:shd w:fill="F6F4EF"/>
             <w:tcMar>
@@ -2945,7 +2962,7 @@
         </w:tc>
         <w:tc>
           <w:tcPr>
-            <w:tcW w:type="dxa" w:w="1928"/>
+            <w:tcW w:type="dxa" w:w="1728"/>
             <w:vAlign w:val="center"/>
             <w:shd w:fill="F6F4EF"/>
             <w:tcMar>
@@ -2977,7 +2994,7 @@
         </w:trPr>
         <w:tc>
           <w:tcPr>
-            <w:tcW w:type="dxa" w:w="680"/>
+            <w:tcW w:type="dxa" w:w="1037"/>
             <w:vAlign w:val="center"/>
             <w:shd w:fill="FFFFFF"/>
             <w:tcMar>
@@ -2989,6 +3006,7 @@
           </w:tcPr>
           <w:p>
             <w:pPr>
+              <w:keepLines/>
               <w:spacing w:after="60" w:before="40" w:line="245" w:lineRule="auto"/>
             </w:pPr>
             <w:r>
@@ -3005,7 +3023,7 @@
         </w:tc>
         <w:tc>
           <w:tcPr>
-            <w:tcW w:type="dxa" w:w="7257"/>
+            <w:tcW w:type="dxa" w:w="7992"/>
             <w:vAlign w:val="center"/>
             <w:shd w:fill="FFFFFF"/>
             <w:tcMar>
@@ -3033,7 +3051,7 @@
         </w:tc>
         <w:tc>
           <w:tcPr>
-            <w:tcW w:type="dxa" w:w="1928"/>
+            <w:tcW w:type="dxa" w:w="1728"/>
             <w:vAlign w:val="center"/>
             <w:shd w:fill="FFFFFF"/>
             <w:tcMar>
@@ -3065,7 +3083,7 @@
         </w:trPr>
         <w:tc>
           <w:tcPr>
-            <w:tcW w:type="dxa" w:w="680"/>
+            <w:tcW w:type="dxa" w:w="1037"/>
             <w:vAlign w:val="center"/>
             <w:shd w:fill="F6F4EF"/>
             <w:tcMar>
@@ -3077,6 +3095,7 @@
           </w:tcPr>
           <w:p>
             <w:pPr>
+              <w:keepLines/>
               <w:spacing w:after="60" w:before="40" w:line="245" w:lineRule="auto"/>
             </w:pPr>
             <w:r>
@@ -3093,7 +3112,7 @@
         </w:tc>
         <w:tc>
           <w:tcPr>
-            <w:tcW w:type="dxa" w:w="7257"/>
+            <w:tcW w:type="dxa" w:w="7992"/>
             <w:vAlign w:val="center"/>
             <w:shd w:fill="F6F4EF"/>
             <w:tcMar>
@@ -3121,7 +3140,7 @@
         </w:tc>
         <w:tc>
           <w:tcPr>
-            <w:tcW w:type="dxa" w:w="1928"/>
+            <w:tcW w:type="dxa" w:w="1728"/>
             <w:vAlign w:val="center"/>
             <w:shd w:fill="F6F4EF"/>
             <w:tcMar>
@@ -3153,22 +3172,8 @@
         <w:spacing w:after="60"/>
       </w:pPr>
       <w:r>
-        <w:rPr>
-          <w:b w:val="0"/>
-          <w:i w:val="0"/>
-          <w:sz w:val="16"/>
-        </w:rPr>
-        <w:t xml:space="preserve">Основание: </w:t>
+        <w:t>Исторический источник унифицированного образца и указаний КС-3 — постановление Госкомстата № 100 от 11.11.1999. Применимость формы определяйте по учетной политике, договору и специальным нормам.</w:t>
       </w:r>
-      <w:hyperlink r:id="rId12">
-        <w:r>
-          <w:rPr>
-            <w:sz w:val="16"/>
-            <w:color w:val="292C30"/>
-          </w:rPr>
-          <w:t>КС-3: указания к форме, постановление Госкомстата № 100 от 11.11.1999</w:t>
-        </w:r>
-      </w:hyperlink>
     </w:p>
     <w:p>
       <w:r>
@@ -3249,7 +3254,7 @@
         </w:trPr>
         <w:tc>
           <w:tcPr>
-            <w:tcW w:type="dxa" w:w="680"/>
+            <w:tcW w:type="dxa" w:w="1037"/>
             <w:vAlign w:val="center"/>
             <w:shd w:fill="292C30"/>
             <w:tcMar>
@@ -3261,6 +3266,7 @@
           </w:tcPr>
           <w:p>
             <w:pPr>
+              <w:keepLines/>
               <w:spacing w:after="60" w:before="40" w:line="245" w:lineRule="auto"/>
             </w:pPr>
             <w:r>
@@ -3277,7 +3283,7 @@
         </w:tc>
         <w:tc>
           <w:tcPr>
-            <w:tcW w:type="dxa" w:w="7257"/>
+            <w:tcW w:type="dxa" w:w="7992"/>
             <w:vAlign w:val="center"/>
             <w:shd w:fill="292C30"/>
             <w:tcMar>
@@ -3305,7 +3311,7 @@
         </w:tc>
         <w:tc>
           <w:tcPr>
-            <w:tcW w:type="dxa" w:w="1928"/>
+            <w:tcW w:type="dxa" w:w="1728"/>
             <w:vAlign w:val="center"/>
             <w:shd w:fill="292C30"/>
             <w:tcMar>
@@ -3338,7 +3344,7 @@
         </w:trPr>
         <w:tc>
           <w:tcPr>
-            <w:tcW w:type="dxa" w:w="680"/>
+            <w:tcW w:type="dxa" w:w="1037"/>
             <w:vAlign w:val="center"/>
             <w:shd w:fill="FFFFFF"/>
             <w:tcMar>
@@ -3350,6 +3356,7 @@
           </w:tcPr>
           <w:p>
             <w:pPr>
+              <w:keepLines/>
               <w:spacing w:after="60" w:before="40" w:line="245" w:lineRule="auto"/>
             </w:pPr>
             <w:r>
@@ -3366,7 +3373,7 @@
         </w:tc>
         <w:tc>
           <w:tcPr>
-            <w:tcW w:type="dxa" w:w="7257"/>
+            <w:tcW w:type="dxa" w:w="7992"/>
             <w:vAlign w:val="center"/>
             <w:shd w:fill="FFFFFF"/>
             <w:tcMar>
@@ -3394,7 +3401,7 @@
         </w:tc>
         <w:tc>
           <w:tcPr>
-            <w:tcW w:type="dxa" w:w="1928"/>
+            <w:tcW w:type="dxa" w:w="1728"/>
             <w:vAlign w:val="center"/>
             <w:shd w:fill="FFFFFF"/>
             <w:tcMar>
@@ -3426,7 +3433,7 @@
         </w:trPr>
         <w:tc>
           <w:tcPr>
-            <w:tcW w:type="dxa" w:w="680"/>
+            <w:tcW w:type="dxa" w:w="1037"/>
             <w:vAlign w:val="center"/>
             <w:shd w:fill="F6F4EF"/>
             <w:tcMar>
@@ -3438,6 +3445,7 @@
           </w:tcPr>
           <w:p>
             <w:pPr>
+              <w:keepLines/>
               <w:spacing w:after="60" w:before="40" w:line="245" w:lineRule="auto"/>
             </w:pPr>
             <w:r>
@@ -3454,7 +3462,7 @@
         </w:tc>
         <w:tc>
           <w:tcPr>
-            <w:tcW w:type="dxa" w:w="7257"/>
+            <w:tcW w:type="dxa" w:w="7992"/>
             <w:vAlign w:val="center"/>
             <w:shd w:fill="F6F4EF"/>
             <w:tcMar>
@@ -3482,7 +3490,7 @@
         </w:tc>
         <w:tc>
           <w:tcPr>
-            <w:tcW w:type="dxa" w:w="1928"/>
+            <w:tcW w:type="dxa" w:w="1728"/>
             <w:vAlign w:val="center"/>
             <w:shd w:fill="F6F4EF"/>
             <w:tcMar>
@@ -3514,7 +3522,7 @@
         </w:trPr>
         <w:tc>
           <w:tcPr>
-            <w:tcW w:type="dxa" w:w="680"/>
+            <w:tcW w:type="dxa" w:w="1037"/>
             <w:vAlign w:val="center"/>
             <w:shd w:fill="FFFFFF"/>
             <w:tcMar>
@@ -3526,6 +3534,7 @@
           </w:tcPr>
           <w:p>
             <w:pPr>
+              <w:keepLines/>
               <w:spacing w:after="60" w:before="40" w:line="245" w:lineRule="auto"/>
             </w:pPr>
             <w:r>
@@ -3542,7 +3551,7 @@
         </w:tc>
         <w:tc>
           <w:tcPr>
-            <w:tcW w:type="dxa" w:w="7257"/>
+            <w:tcW w:type="dxa" w:w="7992"/>
             <w:vAlign w:val="center"/>
             <w:shd w:fill="FFFFFF"/>
             <w:tcMar>
@@ -3570,7 +3579,7 @@
         </w:tc>
         <w:tc>
           <w:tcPr>
-            <w:tcW w:type="dxa" w:w="1928"/>
+            <w:tcW w:type="dxa" w:w="1728"/>
             <w:vAlign w:val="center"/>
             <w:shd w:fill="FFFFFF"/>
             <w:tcMar>
@@ -3602,7 +3611,7 @@
         </w:trPr>
         <w:tc>
           <w:tcPr>
-            <w:tcW w:type="dxa" w:w="680"/>
+            <w:tcW w:type="dxa" w:w="1037"/>
             <w:vAlign w:val="center"/>
             <w:shd w:fill="F6F4EF"/>
             <w:tcMar>
@@ -3614,6 +3623,7 @@
           </w:tcPr>
           <w:p>
             <w:pPr>
+              <w:keepLines/>
               <w:spacing w:after="60" w:before="40" w:line="245" w:lineRule="auto"/>
             </w:pPr>
             <w:r>
@@ -3630,7 +3640,7 @@
         </w:tc>
         <w:tc>
           <w:tcPr>
-            <w:tcW w:type="dxa" w:w="7257"/>
+            <w:tcW w:type="dxa" w:w="7992"/>
             <w:vAlign w:val="center"/>
             <w:shd w:fill="F6F4EF"/>
             <w:tcMar>
@@ -3658,7 +3668,7 @@
         </w:tc>
         <w:tc>
           <w:tcPr>
-            <w:tcW w:type="dxa" w:w="1928"/>
+            <w:tcW w:type="dxa" w:w="1728"/>
             <w:vAlign w:val="center"/>
             <w:shd w:fill="F6F4EF"/>
             <w:tcMar>
@@ -3690,7 +3700,7 @@
         </w:trPr>
         <w:tc>
           <w:tcPr>
-            <w:tcW w:type="dxa" w:w="680"/>
+            <w:tcW w:type="dxa" w:w="1037"/>
             <w:vAlign w:val="center"/>
             <w:shd w:fill="FFFFFF"/>
             <w:tcMar>
@@ -3702,6 +3712,7 @@
           </w:tcPr>
           <w:p>
             <w:pPr>
+              <w:keepLines/>
               <w:spacing w:after="60" w:before="40" w:line="245" w:lineRule="auto"/>
             </w:pPr>
             <w:r>
@@ -3718,7 +3729,7 @@
         </w:tc>
         <w:tc>
           <w:tcPr>
-            <w:tcW w:type="dxa" w:w="7257"/>
+            <w:tcW w:type="dxa" w:w="7992"/>
             <w:vAlign w:val="center"/>
             <w:shd w:fill="FFFFFF"/>
             <w:tcMar>
@@ -3746,7 +3757,7 @@
         </w:tc>
         <w:tc>
           <w:tcPr>
-            <w:tcW w:type="dxa" w:w="1928"/>
+            <w:tcW w:type="dxa" w:w="1728"/>
             <w:vAlign w:val="center"/>
             <w:shd w:fill="FFFFFF"/>
             <w:tcMar>
@@ -3778,7 +3789,7 @@
         </w:trPr>
         <w:tc>
           <w:tcPr>
-            <w:tcW w:type="dxa" w:w="680"/>
+            <w:tcW w:type="dxa" w:w="1037"/>
             <w:vAlign w:val="center"/>
             <w:shd w:fill="F6F4EF"/>
             <w:tcMar>
@@ -3790,6 +3801,7 @@
           </w:tcPr>
           <w:p>
             <w:pPr>
+              <w:keepLines/>
               <w:spacing w:after="60" w:before="40" w:line="245" w:lineRule="auto"/>
             </w:pPr>
             <w:r>
@@ -3806,7 +3818,7 @@
         </w:tc>
         <w:tc>
           <w:tcPr>
-            <w:tcW w:type="dxa" w:w="7257"/>
+            <w:tcW w:type="dxa" w:w="7992"/>
             <w:vAlign w:val="center"/>
             <w:shd w:fill="F6F4EF"/>
             <w:tcMar>
@@ -3834,7 +3846,7 @@
         </w:tc>
         <w:tc>
           <w:tcPr>
-            <w:tcW w:type="dxa" w:w="1928"/>
+            <w:tcW w:type="dxa" w:w="1728"/>
             <w:vAlign w:val="center"/>
             <w:shd w:fill="F6F4EF"/>
             <w:tcMar>
@@ -3866,7 +3878,7 @@
         </w:trPr>
         <w:tc>
           <w:tcPr>
-            <w:tcW w:type="dxa" w:w="680"/>
+            <w:tcW w:type="dxa" w:w="1037"/>
             <w:vAlign w:val="center"/>
             <w:shd w:fill="FFFFFF"/>
             <w:tcMar>
@@ -3878,6 +3890,7 @@
           </w:tcPr>
           <w:p>
             <w:pPr>
+              <w:keepLines/>
               <w:spacing w:after="60" w:before="40" w:line="245" w:lineRule="auto"/>
             </w:pPr>
             <w:r>
@@ -3894,7 +3907,7 @@
         </w:tc>
         <w:tc>
           <w:tcPr>
-            <w:tcW w:type="dxa" w:w="7257"/>
+            <w:tcW w:type="dxa" w:w="7992"/>
             <w:vAlign w:val="center"/>
             <w:shd w:fill="FFFFFF"/>
             <w:tcMar>
@@ -3922,7 +3935,7 @@
         </w:tc>
         <w:tc>
           <w:tcPr>
-            <w:tcW w:type="dxa" w:w="1928"/>
+            <w:tcW w:type="dxa" w:w="1728"/>
             <w:vAlign w:val="center"/>
             <w:shd w:fill="FFFFFF"/>
             <w:tcMar>
@@ -3954,7 +3967,7 @@
         </w:trPr>
         <w:tc>
           <w:tcPr>
-            <w:tcW w:type="dxa" w:w="680"/>
+            <w:tcW w:type="dxa" w:w="1037"/>
             <w:vAlign w:val="center"/>
             <w:shd w:fill="F6F4EF"/>
             <w:tcMar>
@@ -3966,6 +3979,7 @@
           </w:tcPr>
           <w:p>
             <w:pPr>
+              <w:keepLines/>
               <w:spacing w:after="60" w:before="40" w:line="245" w:lineRule="auto"/>
             </w:pPr>
             <w:r>
@@ -3982,7 +3996,7 @@
         </w:tc>
         <w:tc>
           <w:tcPr>
-            <w:tcW w:type="dxa" w:w="7257"/>
+            <w:tcW w:type="dxa" w:w="7992"/>
             <w:vAlign w:val="center"/>
             <w:shd w:fill="F6F4EF"/>
             <w:tcMar>
@@ -4010,7 +4024,7 @@
         </w:tc>
         <w:tc>
           <w:tcPr>
-            <w:tcW w:type="dxa" w:w="1928"/>
+            <w:tcW w:type="dxa" w:w="1728"/>
             <w:vAlign w:val="center"/>
             <w:shd w:fill="F6F4EF"/>
             <w:tcMar>
@@ -4042,7 +4056,7 @@
         </w:trPr>
         <w:tc>
           <w:tcPr>
-            <w:tcW w:type="dxa" w:w="680"/>
+            <w:tcW w:type="dxa" w:w="1037"/>
             <w:vAlign w:val="center"/>
             <w:shd w:fill="FFFFFF"/>
             <w:tcMar>
@@ -4054,6 +4068,7 @@
           </w:tcPr>
           <w:p>
             <w:pPr>
+              <w:keepLines/>
               <w:spacing w:after="60" w:before="40" w:line="245" w:lineRule="auto"/>
             </w:pPr>
             <w:r>
@@ -4070,7 +4085,7 @@
         </w:tc>
         <w:tc>
           <w:tcPr>
-            <w:tcW w:type="dxa" w:w="7257"/>
+            <w:tcW w:type="dxa" w:w="7992"/>
             <w:vAlign w:val="center"/>
             <w:shd w:fill="FFFFFF"/>
             <w:tcMar>
@@ -4098,7 +4113,7 @@
         </w:tc>
         <w:tc>
           <w:tcPr>
-            <w:tcW w:type="dxa" w:w="1928"/>
+            <w:tcW w:type="dxa" w:w="1728"/>
             <w:vAlign w:val="center"/>
             <w:shd w:fill="FFFFFF"/>
             <w:tcMar>
@@ -4130,7 +4145,7 @@
         </w:trPr>
         <w:tc>
           <w:tcPr>
-            <w:tcW w:type="dxa" w:w="680"/>
+            <w:tcW w:type="dxa" w:w="1037"/>
             <w:vAlign w:val="center"/>
             <w:shd w:fill="F6F4EF"/>
             <w:tcMar>
@@ -4142,6 +4157,7 @@
           </w:tcPr>
           <w:p>
             <w:pPr>
+              <w:keepLines/>
               <w:spacing w:after="60" w:before="40" w:line="245" w:lineRule="auto"/>
             </w:pPr>
             <w:r>
@@ -4158,7 +4174,7 @@
         </w:tc>
         <w:tc>
           <w:tcPr>
-            <w:tcW w:type="dxa" w:w="7257"/>
+            <w:tcW w:type="dxa" w:w="7992"/>
             <w:vAlign w:val="center"/>
             <w:shd w:fill="F6F4EF"/>
             <w:tcMar>
@@ -4186,7 +4202,7 @@
         </w:tc>
         <w:tc>
           <w:tcPr>
-            <w:tcW w:type="dxa" w:w="1928"/>
+            <w:tcW w:type="dxa" w:w="1728"/>
             <w:vAlign w:val="center"/>
             <w:shd w:fill="F6F4EF"/>
             <w:tcMar>
@@ -4218,22 +4234,8 @@
         <w:spacing w:after="60"/>
       </w:pPr>
       <w:r>
-        <w:rPr>
-          <w:b w:val="0"/>
-          <w:i w:val="0"/>
-          <w:sz w:val="16"/>
-        </w:rPr>
-        <w:t xml:space="preserve">Основание: </w:t>
+        <w:t>Основание: приказ Минстроя № 344/пр от 16.05.2023, ред. приказа № 369/пр от 23.06.2025; официальное изменение: https://publication.pravo.gov.ru/document/0001202507220009 (дата доступа: 15.10.2026); приложения № 1 и № 2.</w:t>
       </w:r>
-      <w:hyperlink r:id="rId13">
-        <w:r>
-          <w:rPr>
-            <w:sz w:val="16"/>
-            <w:color w:val="292C30"/>
-          </w:rPr>
-          <w:t>Приказ Минстроя № 344/пр от 16.05.2023, ред. 23.06.2025; приложения № 1 и № 2</w:t>
-        </w:r>
-      </w:hyperlink>
     </w:p>
     <w:sectPr>
       <w:headerReference w:type="default" r:id="rId9"/>

</xml_diff>